<commit_message>
HP template: align Customer / Loan amount / HF with tab stops
The three label rows previously used inline spaces between the label,
colon and value, so different label widths pushed the colons to
different columns. Replaced the spaces with two left tab stops in
each paragraph's <w:pPr>:
  - column 1 (colon) at 2200 DXA (~1.53 in)
  - column 2 (value) at 2700 DXA (~1.88 in)
Now every row's colon and value sit on the same vertical line
regardless of label length.

No code change — the placeholder tokens ({{date}}, {{customerName}},
{{loanAmount}}, {{handlingFee}}) are unchanged, so hpDocument.ts
keeps working as-is.

Co-Authored-By: Claude Opus 4.7 <noreply@anthropic.com>
</commit_message>
<xml_diff>
--- a/public/templates/hp-disbursement.docx
+++ b/public/templates/hp-disbursement.docx
@@ -81,6 +81,10 @@
     </w:p>
     <w:p>
       <w:pPr>
+        <w:tabs>
+          <w:tab w:val="left" w:pos="2200"/>
+          <w:tab w:val="left" w:pos="2700"/>
+        </w:tabs>
         <w:rPr>
           <w:sz w:val="28"/>
           <w:szCs w:val="28"/>
@@ -91,11 +95,19 @@
           <w:sz w:val="28"/>
           <w:szCs w:val="28"/>
         </w:rPr>
-        <w:t xml:space="preserve">Customer        :         {{customerName}}</w:t>
+        <w:t>Customer</w:t>
+        <w:tab/>
+        <w:t>:</w:t>
+        <w:tab/>
+        <w:t xml:space="preserve">{{customerName}}</w:t>
       </w:r>
     </w:p>
     <w:p>
       <w:pPr>
+        <w:tabs>
+          <w:tab w:val="left" w:pos="2200"/>
+          <w:tab w:val="left" w:pos="2700"/>
+        </w:tabs>
         <w:rPr>
           <w:sz w:val="28"/>
           <w:szCs w:val="28"/>
@@ -106,11 +118,19 @@
           <w:sz w:val="28"/>
           <w:szCs w:val="28"/>
         </w:rPr>
-        <w:t xml:space="preserve">Loan amount :  {{loanAmount}}</w:t>
+        <w:t>Loan amount</w:t>
+        <w:tab/>
+        <w:t>:</w:t>
+        <w:tab/>
+        <w:t xml:space="preserve">{{loanAmount}}</w:t>
       </w:r>
     </w:p>
     <w:p>
       <w:pPr>
+        <w:tabs>
+          <w:tab w:val="left" w:pos="2200"/>
+          <w:tab w:val="left" w:pos="2700"/>
+        </w:tabs>
         <w:rPr>
           <w:sz w:val="28"/>
           <w:szCs w:val="28"/>
@@ -121,7 +141,11 @@
           <w:sz w:val="28"/>
           <w:szCs w:val="28"/>
         </w:rPr>
-        <w:t xml:space="preserve">HF                       :                        {{handlingFee}}</w:t>
+        <w:t>HF</w:t>
+        <w:tab/>
+        <w:t>:</w:t>
+        <w:tab/>
+        <w:t xml:space="preserve">{{handlingFee}}</w:t>
       </w:r>
     </w:p>
     <w:p>

</xml_diff>